<commit_message>
feat(Claude): Compared another doku with my doku and added good differences to my file. Generated recovery file of my doku
</commit_message>
<xml_diff>
--- a/Lernfeld 10 - Dokumentation AD (überarbeitet).docx
+++ b/Lernfeld 10 - Dokumentation AD (überarbeitet).docx
@@ -129,6 +129,33 @@
     </w:p>
     <w:p>
       <w:pPr>
+        <w:pStyle w:val="ListBullet"/>
+        <w:spacing w:after="40"/>
+      </w:pPr>
+      <w:r>
+        <w:t>Die DC-Teile geben den Domänennamen wieder, nicht den Servernamen. Den richtigen Wert zeigt dsquery domainroot (z. B. DC=rwe01,DC=local).</w:t>
+      </w:r>
+    </w:p>
+    <w:p>
+      <w:pPr>
+        <w:pStyle w:val="ListBullet"/>
+        <w:spacing w:after="40"/>
+      </w:pPr>
+      <w:r>
+        <w:t>Zuerst die OU RWE anlegen, erst danach die Unter-OUs.</w:t>
+      </w:r>
+    </w:p>
+    <w:p>
+      <w:pPr>
+        <w:pStyle w:val="ListBullet"/>
+        <w:spacing w:after="40"/>
+      </w:pPr>
+      <w:r>
+        <w:t>Muss eine OU wieder gelöscht werden: in „Active Directory-Benutzer und -Computer“ Ansicht → Erweiterte Features, dann in den Eigenschaften der OU unter Objekt den Haken „Objekt vor zufälligem Löschen schützen“ entfernen.</w:t>
+      </w:r>
+    </w:p>
+    <w:p>
+      <w:pPr>
         <w:pStyle w:val="Heading1"/>
       </w:pPr>
       <w:r>
@@ -173,6 +200,36 @@
       </w:r>
       <w:r>
         <w:t>0 Zeichen</w:t>
+      </w:r>
+    </w:p>
+    <w:p>
+      <w:pPr>
+        <w:pStyle w:val="ListBullet"/>
+        <w:spacing w:after="40"/>
+      </w:pPr>
+      <w:r>
+        <w:rPr>
+          <w:b/>
+        </w:rPr>
+        <w:t xml:space="preserve">Kennwortchronik erzwingen: </w:t>
+      </w:r>
+      <w:r>
+        <w:t>0 gespeicherte Kennwörter (das alte Kennwort darf wiederverwendet werden)</w:t>
+      </w:r>
+    </w:p>
+    <w:p>
+      <w:pPr>
+        <w:pStyle w:val="ListBullet"/>
+        <w:spacing w:after="40"/>
+      </w:pPr>
+      <w:r>
+        <w:rPr>
+          <w:b/>
+        </w:rPr>
+        <w:t xml:space="preserve">Maximales Kennwortalter: </w:t>
+      </w:r>
+      <w:r>
+        <w:t>0 (Kennwörter laufen nicht ab; die Änderung bei der ersten Anmeldung bleibt trotzdem erzwungen)</w:t>
       </w:r>
     </w:p>
     <w:p>
@@ -710,6 +767,11 @@
       </w:r>
     </w:p>
     <w:p>
+      <w:r>
+        <w:t>Die Skripte werden in Abschnitt 5 mit -loscr am Konto eingetragen. Alternativ lassen sie sich im GPO der jeweiligen OU zuweisen: Benutzerkonfiguration → Richtlinien → Windows-Einstellungen → Skripts → Anmelden → Hinzufügen. Dann entfällt -loscr.</w:t>
+      </w:r>
+    </w:p>
+    <w:p>
       <w:pPr>
         <w:pStyle w:val="Heading1"/>
       </w:pPr>
@@ -831,6 +893,15 @@
       </w:pPr>
       <w:r>
         <w:t>-hmdir trägt den Basisordner nur ein. md legt den Ordner an, icacls gibt dem Benutzer Vollzugriff darauf.</w:t>
+      </w:r>
+    </w:p>
+    <w:p>
+      <w:pPr>
+        <w:pStyle w:val="ListBullet"/>
+        <w:spacing w:after="40"/>
+      </w:pPr>
+      <w:r>
+        <w:t>Alternative ohne -hmdir/-profile, md und icacls: In „Active Directory-Benutzer und -Computer“ alle Konten einer OU markieren → Eigenschaften → Profil. Profilpfad \\KLAUSUR\Profile$\%username% und Basisordner Verbinden Z: mit \\KLAUSUR\Home$\%username% eintragen. Windows legt die Home-Ordner dabei selbst mit den passenden Rechten an.</w:t>
       </w:r>
     </w:p>
     <w:p>
@@ -1543,6 +1614,11 @@
       </w:pPr>
     </w:p>
     <w:p>
+      <w:r>
+        <w:t>Tipp: Unter Administrative Vorlagen findet man Einstellungen schneller über Aktion → Filteroptionen → Schlüsselwortfilter.</w:t>
+      </w:r>
+    </w:p>
+    <w:p>
       <w:pPr>
         <w:pStyle w:val="Heading2"/>
       </w:pPr>
@@ -1561,7 +1637,7 @@
         <w:spacing w:after="40"/>
       </w:pPr>
       <w:r>
-        <w:t>Aktiviert, Maximale Profilgröße: 512000 KB (= 500 MB)</w:t>
+        <w:t>Aktiviert, Maximale Profilgröße: 512000 KB (= 500 MB; rechnet man mit 1000, sind es 500000 KB)</w:t>
       </w:r>
     </w:p>
     <w:p>

</xml_diff>

<commit_message>
Changed a lot of stuff xD
</commit_message>
<xml_diff>
--- a/Lernfeld 10 - Dokumentation AD (überarbeitet).docx
+++ b/Lernfeld 10 - Dokumentation AD (überarbeitet).docx
@@ -32,7 +32,7 @@
         <w:t xml:space="preserve">Umgebung: </w:t>
       </w:r>
       <w:r>
-        <w:t>Server KLAUSUR (Windows Server 2019), Domäne rwe01.local, Windows-10-Client. Die Anleitung setzt voraus, dass AD DS und DNS eingerichtet sind, der Client den Server als DNS-Server nutzt und das Laufwerk X: in der Server-VM vorhanden ist.</w:t>
+        <w:t>Server KSERVER (Windows Server 2019), Domäne klausur.local, Windows-10-Client. Die Anleitung setzt voraus, dass AD DS und DNS eingerichtet sind, der Client den Server als DNS-Server nutzt und das Laufwerk X: in der Server-VM vorhanden ist.</w:t>
       </w:r>
     </w:p>
     <w:p>
@@ -54,7 +54,7 @@
           <w:rFonts w:ascii="Consolas" w:hAnsi="Consolas"/>
           <w:sz w:val="18"/>
         </w:rPr>
-        <w:t>dsadd ou "OU=RWE,DC=rwe01,DC=local"</w:t>
+        <w:t>dsadd ou "OU=RWE,DC=klausur,DC=local"</w:t>
       </w:r>
     </w:p>
     <w:p>
@@ -68,7 +68,7 @@
           <w:rFonts w:ascii="Consolas" w:hAnsi="Consolas"/>
           <w:sz w:val="18"/>
         </w:rPr>
-        <w:t>dsadd ou "OU=Ausbildungswerkstatt,OU=RWE,DC=rwe01,DC=local"</w:t>
+        <w:t>dsadd ou "OU=Ausbildungswerkstatt,OU=RWE,DC=klausur,DC=local"</w:t>
       </w:r>
     </w:p>
     <w:p>
@@ -82,7 +82,7 @@
           <w:rFonts w:ascii="Consolas" w:hAnsi="Consolas"/>
           <w:sz w:val="18"/>
         </w:rPr>
-        <w:t>dsadd ou "OU=IT,OU=RWE,DC=rwe01,DC=local"</w:t>
+        <w:t>dsadd ou "OU=IT,OU=RWE,DC=klausur,DC=local"</w:t>
       </w:r>
     </w:p>
     <w:p>
@@ -96,7 +96,7 @@
           <w:rFonts w:ascii="Consolas" w:hAnsi="Consolas"/>
           <w:sz w:val="18"/>
         </w:rPr>
-        <w:t>dsadd ou "OU=Personal,OU=RWE,DC=rwe01,DC=local"</w:t>
+        <w:t>dsadd ou "OU=Personal,OU=RWE,DC=klausur,DC=local"</w:t>
       </w:r>
     </w:p>
     <w:p>
@@ -110,7 +110,7 @@
           <w:rFonts w:ascii="Consolas" w:hAnsi="Consolas"/>
           <w:sz w:val="18"/>
         </w:rPr>
-        <w:t>dsadd ou "OU=Forschung,OU=RWE,DC=rwe01,DC=local"</w:t>
+        <w:t>dsadd ou "OU=Forschung,OU=RWE,DC=klausur,DC=local"</w:t>
       </w:r>
     </w:p>
     <w:p>
@@ -124,7 +124,7 @@
           <w:rFonts w:ascii="Consolas" w:hAnsi="Consolas"/>
           <w:sz w:val="18"/>
         </w:rPr>
-        <w:t>dsadd ou "OU=Fertigung,OU=RWE,DC=rwe01,DC=local"</w:t>
+        <w:t>dsadd ou "OU=Fertigung,OU=RWE,DC=klausur,DC=local"</w:t>
       </w:r>
     </w:p>
     <w:p>
@@ -133,7 +133,7 @@
         <w:spacing w:after="40"/>
       </w:pPr>
       <w:r>
-        <w:t>Die DC-Teile geben den Domänennamen wieder, nicht den Servernamen. Den richtigen Wert zeigt dsquery domainroot (z. B. DC=rwe01,DC=local).</w:t>
+        <w:t>Die DC-Teile geben den Domänennamen wieder, nicht den Servernamen. Den richtigen Wert zeigt dsquery domainroot (z. B. DC=klausur,DC=local).</w:t>
       </w:r>
     </w:p>
     <w:p>
@@ -689,7 +689,7 @@
     </w:p>
     <w:p>
       <w:r>
-        <w:t>Beide Skripte im Ordner C:\Windows\SYSVOL\sysvol\rwe01.local\scripts (Freigabe NETLOGON) speichern. Im Editor beim Speichern „Alle Dateien“ wählen, damit kein .txt angehängt wird.</w:t>
+        <w:t>Beide Skripte im Ordner C:\Windows\SYSVOL\sysvol\klausur.local\scripts (Freigabe NETLOGON) speichern. Im Editor beim Speichern „Alle Dateien“ wählen, damit kein .txt angehängt wird.</w:t>
       </w:r>
     </w:p>
     <w:p>
@@ -726,7 +726,7 @@
           <w:rFonts w:ascii="Consolas" w:hAnsi="Consolas"/>
           <w:sz w:val="18"/>
         </w:rPr>
-        <w:t>net use T: \\KLAUSUR\Software /persistent:no</w:t>
+        <w:t>net use T: \\KSERVER\Software /persistent:no</w:t>
       </w:r>
     </w:p>
     <w:p>
@@ -763,7 +763,7 @@
           <w:rFonts w:ascii="Consolas" w:hAnsi="Consolas"/>
           <w:sz w:val="18"/>
         </w:rPr>
-        <w:t>net use U: \\KLAUSUR\Ersatzteile /persistent:no</w:t>
+        <w:t>net use U: \\KSERVER\Ersatzteile /persistent:no</w:t>
       </w:r>
     </w:p>
     <w:p>
@@ -823,7 +823,7 @@
           <w:rFonts w:ascii="Consolas" w:hAnsi="Consolas"/>
           <w:sz w:val="18"/>
         </w:rPr>
-        <w:t xml:space="preserve">  dsadd user "CN=Azubi0%%i,OU=Ausbildungswerkstatt,OU=RWE,DC=rwe01,DC=local" -samid Azubi0%%i -pwd az0%%i -mustchpwd yes -disabled no -hmdir \\KLAUSUR\Home$\Azubi0%%i -hmdrv Z: -profile \\KLAUSUR\Profile$\Azubi0%%i</w:t>
+        <w:t xml:space="preserve">  dsadd user "CN=Azubi0%%i,OU=Ausbildungswerkstatt,OU=RWE,DC=klausur,DC=local" -samid Azubi0%%i -pwd az0%%i -mustchpwd yes -disabled no -hmdir \\KSERVER\Home$\Azubi0%%i -hmdrv Z: -profile \\KSERVER\Profile$\Azubi0%%i</w:t>
       </w:r>
     </w:p>
     <w:p>
@@ -851,7 +851,7 @@
           <w:rFonts w:ascii="Consolas" w:hAnsi="Consolas"/>
           <w:sz w:val="18"/>
         </w:rPr>
-        <w:t xml:space="preserve">  icacls C:\Home\Azubi0%%i /grant "RWE01\Azubi0%%i:(OI)(CI)F"</w:t>
+        <w:t xml:space="preserve">  icacls C:\Home\Azubi0%%i /grant "KA\Azubi0%%i:(OI)(CI)F"</w:t>
       </w:r>
     </w:p>
     <w:p>
@@ -901,7 +901,7 @@
         <w:spacing w:after="40"/>
       </w:pPr>
       <w:r>
-        <w:t>Alternative ohne -hmdir/-profile, md und icacls: In „Active Directory-Benutzer und -Computer“ alle Konten einer OU markieren → Eigenschaften → Profil. Profilpfad \\KLAUSUR\Profile$\%username% und Basisordner Verbinden Z: mit \\KLAUSUR\Home$\%username% eintragen. Windows legt die Home-Ordner dabei selbst mit den passenden Rechten an.</w:t>
+        <w:t>Alternative ohne -hmdir/-profile, md und icacls: In „Active Directory-Benutzer und -Computer“ alle Konten einer OU markieren → Eigenschaften → Profil. Profilpfad \\KSERVER\Profile$\%username% und Basisordner Verbinden Z: mit \\KSERVER\Home$\%username% eintragen. Windows legt die Home-Ordner dabei selbst mit den passenden Rechten an.</w:t>
       </w:r>
     </w:p>
     <w:p>
@@ -1695,7 +1695,7 @@
         <w:spacing w:after="40"/>
       </w:pPr>
       <w:r>
-        <w:t>Paket über den UNC-Pfad auswählen, z. B. \\KLAUSUR\Pakete$\GoogleChromeStandaloneEnterprise64.msi. Mit einem lokalen Pfad (C:\…) finden die Clients das Paket nicht.</w:t>
+        <w:t>Paket über den UNC-Pfad auswählen, z. B. \\KSERVER\Pakete$\GoogleChromeStandaloneEnterprise64.msi. Mit einem lokalen Pfad (C:\…) finden die Clients das Paket nicht.</w:t>
       </w:r>
     </w:p>
     <w:p>
@@ -2002,12 +2002,12 @@
         <w:spacing w:after="40"/>
       </w:pPr>
       <w:r>
-        <w:t>In der neuen Zone „Neuer Zeiger (PTR)“: Hostanteil der IP (z. B. 10) → klausur.rwe01.local.</w:t>
+        <w:t>In der neuen Zone „Neuer Zeiger (PTR)“: Hostanteil der IP (z. B. 10) → kserver.klausur.local.</w:t>
       </w:r>
     </w:p>
     <w:p>
       <w:r>
-        <w:t>Alternativ in der Zone rwe01.local den A-Eintrag KLAUSUR öffnen und „Verknüpften PTR-Eintrag aktualisieren“ anhaken.</w:t>
+        <w:t>Alternativ in der Zone klausur.local den A-Eintrag KSERVER öffnen und „Verknüpften PTR-Eintrag aktualisieren“ anhaken.</w:t>
       </w:r>
     </w:p>
     <w:p>
@@ -2025,7 +2025,7 @@
     </w:p>
     <w:p>
       <w:r>
-        <w:t>sysdm.cpl → Computername → Ändern → Mitglied von: Domäne → rwe01.local</w:t>
+        <w:t>sysdm.cpl → Computername → Ändern → Mitglied von: Domäne → klausur.local</w:t>
       </w:r>
     </w:p>
     <w:p>

</xml_diff>